<commit_message>
feat: add document automation scripts and update research paper content with declarations and revisions
</commit_message>
<xml_diff>
--- a/Multi_Cloud_Research_Paper - Copy.docx
+++ b/Multi_Cloud_Research_Paper - Copy.docx
@@ -17941,6 +17941,35 @@
       </w:r>
     </w:p>
     <w:p>
+      <w:pPr/>
+      <w:r>
+        <w:t>Declarations</w:t>
+      </w:r>
+    </w:p>
+    <w:p>
+      <w:r>
+        <w:rPr>
+          <w:b/>
+        </w:rPr>
+        <w:t xml:space="preserve">Conflicts of Interest: </w:t>
+      </w:r>
+      <w:r>
+        <w:t>All authors declare that they have no conflicts of interest.</w:t>
+      </w:r>
+    </w:p>
+    <w:p>
+      <w:r>
+        <w:rPr>
+          <w:b/>
+        </w:rPr>
+        <w:t xml:space="preserve">Use of AI Technology: </w:t>
+      </w:r>
+      <w:r>
+        <w:t>During the preparation of this work, the authors utilized AI technology (Google Gemini) to assist with structural formatting, proofreading, and the standardization of bibliographic references. After using this tool, the authors reviewed and edited the content as needed and take full responsibility for the accuracy and originality of the publication.</w:t>
+      </w:r>
+    </w:p>
+    <w:p/>
+    <w:p>
       <w:pPr>
         <w:pBdr>
           <w:top w:val="nil"/>

</xml_diff>

<commit_message>
feat: add automation scripts for research paper content updates, metadata scrubbing, and anonymization
</commit_message>
<xml_diff>
--- a/Multi_Cloud_Research_Paper - Copy.docx
+++ b/Multi_Cloud_Research_Paper - Copy.docx
@@ -90,193 +90,57 @@
         </w:rPr>
       </w:pPr>
       <w:r>
-        <w:rPr>
-          <w:sz w:val="24"/>
-          <w:szCs w:val="24"/>
-        </w:rPr>
-        <w:t>Priyanshu Kumar Sharma</w:t>
-      </w:r>
-      <w:r>
+        <w:t>Anonymized for Review1, Anonymized for Review2, Anonymized for Review3, Prini Rastogi4</w:t>
+      </w:r>
+    </w:p>
+    <w:p>
+      <w:pPr>
+        <w:ind w:left="243" w:right="243"/>
+        <w:jc w:val="center"/>
+        <w:rPr>
+          <w:i/>
+          <w:iCs/>
+        </w:rPr>
+      </w:pPr>
+      <w:r>
+        <w:t xml:space="preserve">Student1,2,3, School of Engineering, Institution Anonymized, Pune  </w:t>
+      </w:r>
+    </w:p>
+    <w:p>
+      <w:pPr>
+        <w:ind w:left="243" w:right="243"/>
+        <w:jc w:val="center"/>
+        <w:rPr>
+          <w:i/>
+          <w:iCs/>
+        </w:rPr>
+      </w:pPr>
+      <w:r>
+        <w:t>Assistant Professor4, School of Engineering, Institution Anonymized, Pune</w:t>
+      </w:r>
+    </w:p>
+    <w:p>
+      <w:pPr>
+        <w:ind w:left="243" w:right="243"/>
+        <w:jc w:val="center"/>
+        <w:rPr>
+          <w:i/>
+          <w:iCs/>
+        </w:rPr>
+      </w:pPr>
+    </w:p>
+    <w:p>
+      <w:pPr>
+        <w:ind w:left="243" w:right="243"/>
+        <w:jc w:val="center"/>
         <w:rPr>
           <w:sz w:val="24"/>
           <w:szCs w:val="24"/>
           <w:vertAlign w:val="superscript"/>
         </w:rPr>
-        <w:t>1</w:t>
-      </w:r>
-      <w:r>
-        <w:rPr>
-          <w:sz w:val="24"/>
-          <w:szCs w:val="24"/>
-        </w:rPr>
-        <w:t>, Vaishnavi Jadhav</w:t>
-      </w:r>
-      <w:r>
-        <w:rPr>
-          <w:sz w:val="24"/>
-          <w:szCs w:val="24"/>
-          <w:vertAlign w:val="superscript"/>
-        </w:rPr>
-        <w:t>2</w:t>
-      </w:r>
-      <w:r>
-        <w:rPr>
-          <w:sz w:val="24"/>
-          <w:szCs w:val="24"/>
-        </w:rPr>
-        <w:t>, Vaibhav Gulage</w:t>
-      </w:r>
-      <w:r>
-        <w:rPr>
-          <w:sz w:val="24"/>
-          <w:szCs w:val="24"/>
-          <w:vertAlign w:val="superscript"/>
-        </w:rPr>
-        <w:t>3</w:t>
-      </w:r>
-      <w:r>
-        <w:rPr>
-          <w:sz w:val="24"/>
-          <w:szCs w:val="24"/>
-        </w:rPr>
-        <w:t xml:space="preserve">, </w:t>
-      </w:r>
-      <w:proofErr w:type="spellStart"/>
-      <w:r>
-        <w:rPr>
-          <w:sz w:val="24"/>
-          <w:szCs w:val="24"/>
-        </w:rPr>
-        <w:t>Prini</w:t>
-      </w:r>
-      <w:proofErr w:type="spellEnd"/>
-      <w:r>
-        <w:rPr>
-          <w:sz w:val="24"/>
-          <w:szCs w:val="24"/>
-        </w:rPr>
-        <w:t xml:space="preserve"> Rastogi</w:t>
-      </w:r>
-      <w:r>
-        <w:rPr>
-          <w:sz w:val="24"/>
-          <w:szCs w:val="24"/>
-          <w:vertAlign w:val="superscript"/>
-        </w:rPr>
-        <w:t>4</w:t>
-      </w:r>
-    </w:p>
-    <w:p>
-      <w:pPr>
-        <w:ind w:left="243" w:right="243"/>
-        <w:jc w:val="center"/>
-        <w:rPr>
-          <w:i/>
-          <w:iCs/>
-        </w:rPr>
-      </w:pPr>
-      <w:r>
-        <w:rPr>
-          <w:i/>
-          <w:iCs/>
-        </w:rPr>
-        <w:t>Student</w:t>
-      </w:r>
-      <w:r>
-        <w:rPr>
-          <w:i/>
-          <w:iCs/>
-          <w:vertAlign w:val="superscript"/>
-        </w:rPr>
-        <w:t>1,2,3</w:t>
-      </w:r>
-      <w:r>
-        <w:rPr>
-          <w:i/>
-          <w:iCs/>
-        </w:rPr>
-        <w:t>, School of Engineering</w:t>
-      </w:r>
-      <w:r>
-        <w:rPr>
-          <w:i/>
-          <w:iCs/>
-        </w:rPr>
-        <w:t xml:space="preserve">, </w:t>
-      </w:r>
-      <w:r>
-        <w:rPr>
-          <w:i/>
-          <w:iCs/>
-        </w:rPr>
-        <w:t xml:space="preserve">Ajeenkya D Y Patil University, Pune  </w:t>
-      </w:r>
-    </w:p>
-    <w:p>
-      <w:pPr>
-        <w:ind w:left="243" w:right="243"/>
-        <w:jc w:val="center"/>
-        <w:rPr>
-          <w:i/>
-          <w:iCs/>
-        </w:rPr>
-      </w:pPr>
-      <w:r>
-        <w:rPr>
-          <w:i/>
-          <w:iCs/>
-        </w:rPr>
-        <w:t>Assistant Professor</w:t>
-      </w:r>
-      <w:r>
-        <w:rPr>
-          <w:i/>
-          <w:iCs/>
-          <w:vertAlign w:val="superscript"/>
-        </w:rPr>
-        <w:t>4</w:t>
-      </w:r>
-      <w:r>
-        <w:rPr>
-          <w:i/>
-          <w:iCs/>
-        </w:rPr>
-        <w:t>, School of Engineering, Ajeenkya D Y Patil University, Pune</w:t>
-      </w:r>
-    </w:p>
-    <w:p>
-      <w:pPr>
-        <w:ind w:left="243" w:right="243"/>
-        <w:jc w:val="center"/>
-        <w:rPr>
-          <w:i/>
-          <w:iCs/>
-        </w:rPr>
-      </w:pPr>
-    </w:p>
-    <w:p>
-      <w:pPr>
-        <w:ind w:left="243" w:right="243"/>
-        <w:jc w:val="center"/>
-        <w:rPr>
-          <w:sz w:val="24"/>
-          <w:szCs w:val="24"/>
-          <w:vertAlign w:val="superscript"/>
-        </w:rPr>
-      </w:pPr>
-      <w:r>
-        <w:t xml:space="preserve">Correspondence Author- </w:t>
-      </w:r>
-      <w:hyperlink r:id="rId6" w:history="1">
-        <w:r>
-          <w:rPr>
-            <w:rStyle w:val="Hyperlink"/>
-          </w:rPr>
-          <w:t>priyanshu17ks@gmail.com</w:t>
-        </w:r>
-      </w:hyperlink>
-      <w:r>
-        <w:t>,</w:t>
+      </w:pPr>
+      <w:r>
+        <w:t>Correspondence Author- email@anonymized.com,</w:t>
       </w:r>
     </w:p>
     <w:p>
@@ -312,73 +176,7 @@
         </w:rPr>
       </w:pPr>
       <w:r>
-        <w:rPr>
-          <w:sz w:val="20"/>
-          <w:szCs w:val="20"/>
-        </w:rPr>
-        <w:t xml:space="preserve">Cloud adoption has accelerated faster than operational standardization, creating a persistent gap between infrastructure capability and </w:t>
-      </w:r>
-      <w:r>
-        <w:rPr>
-          <w:sz w:val="20"/>
-          <w:szCs w:val="20"/>
-        </w:rPr>
-        <w:t>daily</w:t>
-      </w:r>
-      <w:r>
-        <w:rPr>
-          <w:sz w:val="20"/>
-          <w:szCs w:val="20"/>
-        </w:rPr>
-        <w:t xml:space="preserve"> manageability. Existing studies describe this gap through vendor lock-in, fragmented governance, and inconsistent automation practices</w:t>
-      </w:r>
-      <w:hyperlink w:anchor="_heading=h.m8sji24l8fj4">
-        <w:r>
-          <w:rPr>
-            <w:sz w:val="20"/>
-            <w:szCs w:val="20"/>
-          </w:rPr>
-          <w:t>.</w:t>
-        </w:r>
-      </w:hyperlink>
-      <w:r>
-        <w:rPr>
-          <w:sz w:val="20"/>
-          <w:szCs w:val="20"/>
-        </w:rPr>
-        <w:t xml:space="preserve"> This paper addresses that gap with </w:t>
-      </w:r>
-      <w:r>
-        <w:rPr>
-          <w:i/>
-          <w:iCs/>
-          <w:sz w:val="20"/>
-          <w:szCs w:val="20"/>
-        </w:rPr>
-        <w:t>Nebula</w:t>
-      </w:r>
-      <w:r>
-        <w:rPr>
-          <w:sz w:val="20"/>
-          <w:szCs w:val="20"/>
-        </w:rPr>
-        <w:t xml:space="preserve">, an implementation-driven AWS orchestration platform that consolidates provisioning, inventory synchronization, health monitoring, and cost visibility into a single control surface. The system combines React for interface unification, </w:t>
-      </w:r>
-      <w:proofErr w:type="spellStart"/>
-      <w:r>
-        <w:rPr>
-          <w:sz w:val="20"/>
-          <w:szCs w:val="20"/>
-        </w:rPr>
-        <w:t>FastAPI</w:t>
-      </w:r>
-      <w:proofErr w:type="spellEnd"/>
-      <w:r>
-        <w:rPr>
-          <w:sz w:val="20"/>
-          <w:szCs w:val="20"/>
-        </w:rPr>
-        <w:t xml:space="preserve"> for service orchestration, PostgreSQL for persistent metadata, Celery and Redis for asynchronous execution, and terraform for reproducible AWS infrastructure workflows.</w:t>
+        <w:t>Cloud adoption has accelerated faster than operational standardization, creating a persistent gap between infrastructure capability and manageability. This paper addresses search gaps with Nebula, an implementation-driven AWS orchestration platform that consolidates provisioning, inventory synchronization, monitoring, and cost visibility into a single control surface. The system utilizes React, FastAPI, PostgreSQL, Celery, and Terraform to achieve infrastructure reproducibility. The study demonstrates how a layered orchestration model decouples user-facing workflows from long-running cloud operations while preserving traceability. Empirical results derived from our AWS implementation show 25 tracked resources, 145 ms provider-health latency, and sub-100 ms API acknowledgement under concurrent load. These findings indicate that standardized cloud operations are achievable without sacrificing responsiveness. The approach establishes a defensible technical baseline for future multi-cloud expansion.</w:t>
       </w:r>
     </w:p>
     <w:p>
@@ -17910,11 +17708,7 @@
         </w:rPr>
       </w:pPr>
       <w:r>
-        <w:rPr>
-          <w:smallCaps/>
-          <w:color w:val="000000"/>
-        </w:rPr>
-        <w:t>Acknowledgements</w:t>
+        <w:t>Acknowledgements removed for blind review.</w:t>
       </w:r>
     </w:p>
     <w:p>
@@ -17966,6 +17760,11 @@
       </w:r>
       <w:r>
         <w:t>During the preparation of this work, the authors utilized AI technology (Google Gemini) to assist with structural formatting, proofreading, and the standardization of bibliographic references. After using this tool, the authors reviewed and edited the content as needed and take full responsibility for the accuracy and originality of the publication.</w:t>
+      </w:r>
+    </w:p>
+    <w:p>
+      <w:r>
+        <w:t>Notes to the Editor: This manuscript describes the design and implementation of the Nebula AWS orchestration platform. The authors confirm that this work is original and has not been submitted for publication elsewhere.</w:t>
       </w:r>
     </w:p>
     <w:p/>

</xml_diff>